<commit_message>
update on 2025-07-21 11:05:40.259075
</commit_message>
<xml_diff>
--- a/cpp 系统交互.docx
+++ b/cpp 系统交互.docx
@@ -4500,12 +4500,6 @@
             <w:insideH w:val="single" w:color="auto" w:sz="4" w:space="0"/>
             <w:insideV w:val="single" w:color="auto" w:sz="4" w:space="0"/>
           </w:tblBorders>
-          <w:tblCellMar>
-            <w:top w:w="0" w:type="dxa"/>
-            <w:left w:w="108" w:type="dxa"/>
-            <w:bottom w:w="0" w:type="dxa"/>
-            <w:right w:w="108" w:type="dxa"/>
-          </w:tblCellMar>
         </w:tblPrEx>
         <w:trPr>
           <w:trHeight w:val="182" w:hRule="atLeast"/>
@@ -14735,12 +14729,6 @@
             <w:insideH w:val="single" w:color="auto" w:sz="4" w:space="0"/>
             <w:insideV w:val="single" w:color="auto" w:sz="4" w:space="0"/>
           </w:tblBorders>
-          <w:tblCellMar>
-            <w:top w:w="0" w:type="dxa"/>
-            <w:left w:w="108" w:type="dxa"/>
-            <w:bottom w:w="0" w:type="dxa"/>
-            <w:right w:w="108" w:type="dxa"/>
-          </w:tblCellMar>
         </w:tblPrEx>
         <w:tc>
           <w:tcPr>
@@ -17329,6 +17317,14 @@
       </w:tblGrid>
       <w:tr>
         <w:tblPrEx>
+          <w:tblBorders>
+            <w:top w:val="single" w:color="auto" w:sz="4" w:space="0"/>
+            <w:left w:val="single" w:color="auto" w:sz="4" w:space="0"/>
+            <w:bottom w:val="single" w:color="auto" w:sz="4" w:space="0"/>
+            <w:right w:val="single" w:color="auto" w:sz="4" w:space="0"/>
+            <w:insideH w:val="single" w:color="auto" w:sz="4" w:space="0"/>
+            <w:insideV w:val="single" w:color="auto" w:sz="4" w:space="0"/>
+          </w:tblBorders>
           <w:tblCellMar>
             <w:top w:w="0" w:type="dxa"/>
             <w:left w:w="108" w:type="dxa"/>
@@ -19382,12 +19378,6 @@
             <w:insideH w:val="single" w:color="auto" w:sz="4" w:space="0"/>
             <w:insideV w:val="single" w:color="auto" w:sz="4" w:space="0"/>
           </w:tblBorders>
-          <w:tblCellMar>
-            <w:top w:w="0" w:type="dxa"/>
-            <w:left w:w="108" w:type="dxa"/>
-            <w:bottom w:w="0" w:type="dxa"/>
-            <w:right w:w="108" w:type="dxa"/>
-          </w:tblCellMar>
         </w:tblPrEx>
         <w:tc>
           <w:tcPr>
@@ -23461,12 +23451,6 @@
             <w:insideH w:val="single" w:color="auto" w:sz="4" w:space="0"/>
             <w:insideV w:val="single" w:color="auto" w:sz="4" w:space="0"/>
           </w:tblBorders>
-          <w:tblCellMar>
-            <w:top w:w="0" w:type="dxa"/>
-            <w:left w:w="108" w:type="dxa"/>
-            <w:bottom w:w="0" w:type="dxa"/>
-            <w:right w:w="108" w:type="dxa"/>
-          </w:tblCellMar>
         </w:tblPrEx>
         <w:trPr>
           <w:trHeight w:val="139" w:hRule="atLeast"/>
@@ -23991,6 +23975,12 @@
             <w:insideH w:val="single" w:color="auto" w:sz="4" w:space="0"/>
             <w:insideV w:val="single" w:color="auto" w:sz="4" w:space="0"/>
           </w:tblBorders>
+          <w:tblCellMar>
+            <w:top w:w="0" w:type="dxa"/>
+            <w:left w:w="108" w:type="dxa"/>
+            <w:bottom w:w="0" w:type="dxa"/>
+            <w:right w:w="108" w:type="dxa"/>
+          </w:tblCellMar>
         </w:tblPrEx>
         <w:trPr>
           <w:trHeight w:val="139" w:hRule="atLeast"/>
@@ -30938,14 +30928,6 @@
       </w:tblGrid>
       <w:tr>
         <w:tblPrEx>
-          <w:tblBorders>
-            <w:top w:val="single" w:color="auto" w:sz="4" w:space="0"/>
-            <w:left w:val="single" w:color="auto" w:sz="4" w:space="0"/>
-            <w:bottom w:val="single" w:color="auto" w:sz="4" w:space="0"/>
-            <w:right w:val="single" w:color="auto" w:sz="4" w:space="0"/>
-            <w:insideH w:val="single" w:color="auto" w:sz="4" w:space="0"/>
-            <w:insideV w:val="single" w:color="auto" w:sz="4" w:space="0"/>
-          </w:tblBorders>
           <w:tblCellMar>
             <w:top w:w="0" w:type="dxa"/>
             <w:left w:w="108" w:type="dxa"/>
@@ -31467,8 +31449,6 @@
               </w:rPr>
               <w:t>，多个field的结构体</w:t>
             </w:r>
-            <w:bookmarkStart w:id="0" w:name="_GoBack"/>
-            <w:bookmarkEnd w:id="0"/>
             <w:r>
               <w:rPr>
                 <w:rFonts w:hint="eastAsia" w:ascii="华文中宋" w:hAnsi="华文中宋" w:eastAsia="华文中宋" w:cs="华文中宋"/>
@@ -33427,14 +33407,6 @@
       </w:tblGrid>
       <w:tr>
         <w:tblPrEx>
-          <w:tblBorders>
-            <w:top w:val="single" w:color="auto" w:sz="4" w:space="0"/>
-            <w:left w:val="single" w:color="auto" w:sz="4" w:space="0"/>
-            <w:bottom w:val="single" w:color="auto" w:sz="4" w:space="0"/>
-            <w:right w:val="single" w:color="auto" w:sz="4" w:space="0"/>
-            <w:insideH w:val="single" w:color="auto" w:sz="4" w:space="0"/>
-            <w:insideV w:val="single" w:color="auto" w:sz="4" w:space="0"/>
-          </w:tblBorders>
           <w:tblCellMar>
             <w:top w:w="0" w:type="dxa"/>
             <w:left w:w="108" w:type="dxa"/>
@@ -39616,8 +39588,8 @@
         </w:tblCellMar>
       </w:tblPr>
       <w:tblGrid>
-        <w:gridCol w:w="4981"/>
-        <w:gridCol w:w="1057"/>
+        <w:gridCol w:w="5835"/>
+        <w:gridCol w:w="1367"/>
       </w:tblGrid>
       <w:tr>
         <w:tblPrEx>
@@ -39629,12 +39601,6 @@
             <w:insideH w:val="single" w:color="auto" w:sz="4" w:space="0"/>
             <w:insideV w:val="single" w:color="auto" w:sz="4" w:space="0"/>
           </w:tblBorders>
-          <w:tblCellMar>
-            <w:top w:w="0" w:type="dxa"/>
-            <w:left w:w="108" w:type="dxa"/>
-            <w:bottom w:w="0" w:type="dxa"/>
-            <w:right w:w="108" w:type="dxa"/>
-          </w:tblCellMar>
         </w:tblPrEx>
         <w:tc>
           <w:tcPr>
@@ -39690,40 +39656,40 @@
               <w:bidi w:val="0"/>
               <w:jc w:val="both"/>
               <w:rPr>
-                <w:rFonts w:hint="eastAsia"/>
-                <w:lang w:val="en-US" w:eastAsia="zh-CN"/>
-              </w:rPr>
-            </w:pPr>
-            <w:r>
-              <w:rPr>
-                <w:rFonts w:hint="eastAsia"/>
-                <w:lang w:val="en-US" w:eastAsia="zh-CN"/>
-              </w:rPr>
-              <w:t>rosrun image_view image_view image:=&lt;topic&gt;</w:t>
-            </w:r>
-          </w:p>
-        </w:tc>
-        <w:tc>
-          <w:tcPr>
-            <w:tcW w:w="0" w:type="auto"/>
-            <w:vAlign w:val="center"/>
-          </w:tcPr>
-          <w:p>
-            <w:pPr>
-              <w:jc w:val="both"/>
-              <w:rPr>
                 <w:rFonts w:hint="default"/>
-                <w:vertAlign w:val="baseline"/>
-                <w:lang w:val="en-US" w:eastAsia="zh-CN"/>
-              </w:rPr>
-            </w:pPr>
-            <w:r>
+                <w:lang w:val="en-US" w:eastAsia="zh-CN"/>
+              </w:rPr>
+            </w:pPr>
+            <w:r>
+              <w:rPr>
+                <w:rFonts w:hint="eastAsia"/>
+                <w:lang w:val="en-US" w:eastAsia="zh-CN"/>
+              </w:rPr>
+              <w:t>rviz -d &lt;*.rviz&gt;</w:t>
+            </w:r>
+          </w:p>
+        </w:tc>
+        <w:tc>
+          <w:tcPr>
+            <w:tcW w:w="0" w:type="auto"/>
+            <w:vAlign w:val="center"/>
+          </w:tcPr>
+          <w:p>
+            <w:pPr>
+              <w:jc w:val="both"/>
               <w:rPr>
                 <w:rStyle w:val="14"/>
-                <w:rFonts w:hint="eastAsia"/>
-                <w:lang w:val="en-US" w:eastAsia="zh-CN"/>
-              </w:rPr>
-              <w:t>显示图像</w:t>
+                <w:rFonts w:hint="default"/>
+                <w:lang w:val="en-US" w:eastAsia="zh-CN"/>
+              </w:rPr>
+            </w:pPr>
+            <w:r>
+              <w:rPr>
+                <w:rStyle w:val="14"/>
+                <w:rFonts w:hint="eastAsia"/>
+                <w:lang w:val="en-US" w:eastAsia="zh-CN"/>
+              </w:rPr>
+              <w:t>可视化</w:t>
             </w:r>
           </w:p>
         </w:tc>
@@ -39765,7 +39731,7 @@
                 <w:rFonts w:hint="eastAsia"/>
                 <w:lang w:val="en-US" w:eastAsia="zh-CN"/>
               </w:rPr>
-              <w:t>rviz</w:t>
+              <w:t>rqt_graph</w:t>
             </w:r>
           </w:p>
         </w:tc>
@@ -39789,7 +39755,7 @@
                 <w:rFonts w:hint="eastAsia"/>
                 <w:lang w:val="en-US" w:eastAsia="zh-CN"/>
               </w:rPr>
-              <w:t>可视化</w:t>
+              <w:t>话题</w:t>
             </w:r>
           </w:p>
         </w:tc>
@@ -39814,6 +39780,7 @@
         <w:tc>
           <w:tcPr>
             <w:tcW w:w="0" w:type="auto"/>
+            <w:shd w:val="clear"/>
             <w:vAlign w:val="center"/>
           </w:tcPr>
           <w:p>
@@ -39822,6 +39789,91 @@
               <w:bidi w:val="0"/>
               <w:jc w:val="both"/>
               <w:rPr>
+                <w:rFonts w:hint="eastAsia" w:ascii="华文中宋" w:hAnsi="华文中宋" w:eastAsia="华文中宋" w:cs="华文中宋"/>
+                <w:b/>
+                <w:bCs/>
+                <w:color w:val="FF0000"/>
+                <w:kern w:val="2"/>
+                <w:sz w:val="21"/>
+                <w:szCs w:val="21"/>
+                <w:lang w:val="en-US" w:eastAsia="zh-CN" w:bidi="ar-SA"/>
+              </w:rPr>
+            </w:pPr>
+            <w:r>
+              <w:rPr>
+                <w:rFonts w:hint="eastAsia"/>
+                <w:lang w:val="en-US" w:eastAsia="zh-CN"/>
+              </w:rPr>
+              <w:t>rosrun image_view image_view image:=&lt;topic&gt;</w:t>
+            </w:r>
+          </w:p>
+        </w:tc>
+        <w:tc>
+          <w:tcPr>
+            <w:tcW w:w="0" w:type="auto"/>
+            <w:shd w:val="clear"/>
+            <w:vAlign w:val="center"/>
+          </w:tcPr>
+          <w:p>
+            <w:pPr>
+              <w:jc w:val="both"/>
+              <w:rPr>
+                <w:rFonts w:hint="eastAsia" w:ascii="华文中宋" w:hAnsi="华文中宋" w:eastAsia="华文中宋" w:cs="华文中宋"/>
+                <w:b/>
+                <w:bCs/>
+                <w:color w:val="ED7D31" w:themeColor="accent2"/>
+                <w:kern w:val="2"/>
+                <w:sz w:val="21"/>
+                <w:szCs w:val="21"/>
+                <w:vertAlign w:val="baseline"/>
+                <w:lang w:val="en-US" w:eastAsia="zh-CN" w:bidi="ar-SA"/>
+                <w14:textFill>
+                  <w14:solidFill>
+                    <w14:schemeClr w14:val="accent2"/>
+                  </w14:solidFill>
+                </w14:textFill>
+              </w:rPr>
+            </w:pPr>
+            <w:r>
+              <w:rPr>
+                <w:rStyle w:val="14"/>
+                <w:rFonts w:hint="eastAsia"/>
+                <w:lang w:val="en-US" w:eastAsia="zh-CN"/>
+              </w:rPr>
+              <w:t>显示图像</w:t>
+            </w:r>
+          </w:p>
+        </w:tc>
+      </w:tr>
+      <w:tr>
+        <w:tblPrEx>
+          <w:tblBorders>
+            <w:top w:val="single" w:color="auto" w:sz="4" w:space="0"/>
+            <w:left w:val="single" w:color="auto" w:sz="4" w:space="0"/>
+            <w:bottom w:val="single" w:color="auto" w:sz="4" w:space="0"/>
+            <w:right w:val="single" w:color="auto" w:sz="4" w:space="0"/>
+            <w:insideH w:val="single" w:color="auto" w:sz="4" w:space="0"/>
+            <w:insideV w:val="single" w:color="auto" w:sz="4" w:space="0"/>
+          </w:tblBorders>
+          <w:tblCellMar>
+            <w:top w:w="0" w:type="dxa"/>
+            <w:left w:w="108" w:type="dxa"/>
+            <w:bottom w:w="0" w:type="dxa"/>
+            <w:right w:w="108" w:type="dxa"/>
+          </w:tblCellMar>
+        </w:tblPrEx>
+        <w:tc>
+          <w:tcPr>
+            <w:tcW w:w="0" w:type="auto"/>
+            <w:shd w:val="clear"/>
+            <w:vAlign w:val="center"/>
+          </w:tcPr>
+          <w:p>
+            <w:pPr>
+              <w:pStyle w:val="13"/>
+              <w:bidi w:val="0"/>
+              <w:jc w:val="both"/>
+              <w:rPr>
                 <w:rFonts w:hint="default"/>
                 <w:lang w:val="en-US" w:eastAsia="zh-CN"/>
               </w:rPr>
@@ -39831,13 +39883,14 @@
                 <w:rFonts w:hint="eastAsia"/>
                 <w:lang w:val="en-US" w:eastAsia="zh-CN"/>
               </w:rPr>
-              <w:t>rqt_graph</w:t>
-            </w:r>
-          </w:p>
-        </w:tc>
-        <w:tc>
-          <w:tcPr>
-            <w:tcW w:w="0" w:type="auto"/>
+              <w:t>rosrun moveit_setup_assistant moveit_setup_assistant</w:t>
+            </w:r>
+          </w:p>
+        </w:tc>
+        <w:tc>
+          <w:tcPr>
+            <w:tcW w:w="0" w:type="auto"/>
+            <w:shd w:val="clear"/>
             <w:vAlign w:val="center"/>
           </w:tcPr>
           <w:p>
@@ -39855,8 +39908,10 @@
                 <w:rFonts w:hint="eastAsia"/>
                 <w:lang w:val="en-US" w:eastAsia="zh-CN"/>
               </w:rPr>
-              <w:t>话题</w:t>
-            </w:r>
+              <w:t>moveit配置</w:t>
+            </w:r>
+            <w:bookmarkStart w:id="0" w:name="_GoBack"/>
+            <w:bookmarkEnd w:id="0"/>
           </w:p>
         </w:tc>
       </w:tr>
@@ -43599,12 +43654,6 @@
             <w:insideH w:val="single" w:color="auto" w:sz="4" w:space="0"/>
             <w:insideV w:val="single" w:color="auto" w:sz="4" w:space="0"/>
           </w:tblBorders>
-          <w:tblCellMar>
-            <w:top w:w="0" w:type="dxa"/>
-            <w:left w:w="108" w:type="dxa"/>
-            <w:bottom w:w="0" w:type="dxa"/>
-            <w:right w:w="108" w:type="dxa"/>
-          </w:tblCellMar>
         </w:tblPrEx>
         <w:tc>
           <w:tcPr>

</xml_diff>